<commit_message>
feat: complete end-to-end Loan Portfolio Risk Analytics dashboard, TMDL semantic model, SQL scripts, and comprehensive README
</commit_message>
<xml_diff>
--- a/SQL queries Doc.docx
+++ b/SQL queries Doc.docx
@@ -19,16 +19,7 @@
           <w:szCs w:val="72"/>
           <w:highlight w:val="yellow"/>
         </w:rPr>
-        <w:t>SQL queries</w:t>
-      </w:r>
-      <w:r>
-        <w:rPr>
-          <w:color w:val="EE0000"/>
-          <w:sz w:val="72"/>
-          <w:szCs w:val="72"/>
-          <w:highlight w:val="yellow"/>
-        </w:rPr>
-        <w:t xml:space="preserve"> Doc</w:t>
+        <w:t>SQL queries Doc</w:t>
       </w:r>
     </w:p>
     <w:p>
@@ -84,6 +75,7 @@
       </w:pPr>
       <w:r>
         <w:rPr>
+          <w:noProof/>
           <w:sz w:val="36"/>
           <w:szCs w:val="36"/>
         </w:rPr>
@@ -124,6 +116,9 @@
         </w:drawing>
       </w:r>
       <w:r>
+        <w:rPr>
+          <w:noProof/>
+        </w:rPr>
         <w:drawing>
           <wp:inline distT="0" distB="0" distL="0" distR="0" wp14:anchorId="7FD63D7C" wp14:editId="277BB0C1">
             <wp:extent cx="2201310" cy="700405"/>
@@ -256,6 +251,7 @@
       </w:pPr>
       <w:r>
         <w:rPr>
+          <w:noProof/>
           <w:sz w:val="36"/>
           <w:szCs w:val="36"/>
         </w:rPr>
@@ -297,6 +293,7 @@
       </w:r>
       <w:r>
         <w:rPr>
+          <w:noProof/>
           <w:sz w:val="36"/>
           <w:szCs w:val="36"/>
         </w:rPr>
@@ -369,6 +366,7 @@
       </w:pPr>
       <w:r>
         <w:rPr>
+          <w:noProof/>
           <w:sz w:val="36"/>
           <w:szCs w:val="36"/>
         </w:rPr>
@@ -410,6 +408,7 @@
       </w:r>
       <w:r>
         <w:rPr>
+          <w:noProof/>
           <w:sz w:val="36"/>
           <w:szCs w:val="36"/>
         </w:rPr>
@@ -580,6 +579,7 @@
       </w:pPr>
       <w:r>
         <w:rPr>
+          <w:noProof/>
           <w:sz w:val="36"/>
           <w:szCs w:val="36"/>
         </w:rPr>
@@ -621,6 +621,7 @@
       </w:r>
       <w:r>
         <w:rPr>
+          <w:noProof/>
           <w:sz w:val="36"/>
           <w:szCs w:val="36"/>
         </w:rPr>
@@ -775,6 +776,7 @@
       </w:pPr>
       <w:r>
         <w:rPr>
+          <w:noProof/>
           <w:sz w:val="36"/>
           <w:szCs w:val="36"/>
         </w:rPr>
@@ -816,6 +818,7 @@
       </w:r>
       <w:r>
         <w:rPr>
+          <w:noProof/>
           <w:sz w:val="36"/>
           <w:szCs w:val="36"/>
         </w:rPr>
@@ -969,6 +972,7 @@
       </w:pPr>
       <w:r>
         <w:rPr>
+          <w:noProof/>
           <w:sz w:val="36"/>
           <w:szCs w:val="36"/>
         </w:rPr>
@@ -1010,6 +1014,7 @@
       </w:r>
       <w:r>
         <w:rPr>
+          <w:noProof/>
           <w:sz w:val="36"/>
           <w:szCs w:val="36"/>
         </w:rPr>
@@ -1163,6 +1168,7 @@
       </w:pPr>
       <w:r>
         <w:rPr>
+          <w:noProof/>
           <w:sz w:val="36"/>
           <w:szCs w:val="36"/>
         </w:rPr>
@@ -1204,6 +1210,7 @@
       </w:r>
       <w:r>
         <w:rPr>
+          <w:noProof/>
           <w:sz w:val="36"/>
           <w:szCs w:val="36"/>
         </w:rPr>
@@ -1357,6 +1364,7 @@
       </w:pPr>
       <w:r>
         <w:rPr>
+          <w:noProof/>
           <w:sz w:val="36"/>
           <w:szCs w:val="36"/>
         </w:rPr>
@@ -1398,6 +1406,7 @@
       </w:r>
       <w:r>
         <w:rPr>
+          <w:noProof/>
           <w:sz w:val="36"/>
           <w:szCs w:val="36"/>
         </w:rPr>
@@ -1572,6 +1581,7 @@
       </w:pPr>
       <w:r>
         <w:rPr>
+          <w:noProof/>
           <w:color w:val="000000" w:themeColor="text1"/>
           <w:sz w:val="36"/>
           <w:szCs w:val="36"/>
@@ -1614,6 +1624,7 @@
       </w:r>
       <w:r>
         <w:rPr>
+          <w:noProof/>
           <w:color w:val="000000" w:themeColor="text1"/>
           <w:sz w:val="36"/>
           <w:szCs w:val="36"/>
@@ -1701,6 +1712,7 @@
       </w:pPr>
       <w:r>
         <w:rPr>
+          <w:noProof/>
           <w:color w:val="000000" w:themeColor="text1"/>
           <w:sz w:val="36"/>
           <w:szCs w:val="36"/>
@@ -1743,6 +1755,7 @@
       </w:r>
       <w:r>
         <w:rPr>
+          <w:noProof/>
           <w:color w:val="000000" w:themeColor="text1"/>
           <w:sz w:val="36"/>
           <w:szCs w:val="36"/>
@@ -1895,6 +1908,7 @@
       </w:pPr>
       <w:r>
         <w:rPr>
+          <w:noProof/>
           <w:color w:val="000000" w:themeColor="text1"/>
           <w:sz w:val="36"/>
           <w:szCs w:val="36"/>
@@ -1937,6 +1951,7 @@
       </w:r>
       <w:r>
         <w:rPr>
+          <w:noProof/>
           <w:color w:val="000000" w:themeColor="text1"/>
           <w:sz w:val="36"/>
           <w:szCs w:val="36"/>
@@ -2163,6 +2178,7 @@
       </w:r>
       <w:r>
         <w:rPr>
+          <w:noProof/>
           <w:color w:val="000000" w:themeColor="text1"/>
           <w:sz w:val="36"/>
           <w:szCs w:val="36"/>
@@ -2205,6 +2221,7 @@
       </w:r>
       <w:r>
         <w:rPr>
+          <w:noProof/>
           <w:color w:val="000000" w:themeColor="text1"/>
           <w:sz w:val="36"/>
           <w:szCs w:val="36"/>
@@ -2341,6 +2358,7 @@
       </w:pPr>
       <w:r>
         <w:rPr>
+          <w:noProof/>
           <w:color w:val="000000" w:themeColor="text1"/>
           <w:sz w:val="36"/>
           <w:szCs w:val="36"/>
@@ -2383,6 +2401,7 @@
       </w:r>
       <w:r>
         <w:rPr>
+          <w:noProof/>
           <w:color w:val="000000" w:themeColor="text1"/>
           <w:sz w:val="36"/>
           <w:szCs w:val="36"/>
@@ -2555,6 +2574,7 @@
       </w:pPr>
       <w:r>
         <w:rPr>
+          <w:noProof/>
           <w:color w:val="000000" w:themeColor="text1"/>
           <w:sz w:val="36"/>
           <w:szCs w:val="36"/>
@@ -2597,6 +2617,7 @@
       </w:r>
       <w:r>
         <w:rPr>
+          <w:noProof/>
           <w:color w:val="000000" w:themeColor="text1"/>
           <w:sz w:val="36"/>
           <w:szCs w:val="36"/>
@@ -2743,6 +2764,7 @@
       </w:pPr>
       <w:r>
         <w:rPr>
+          <w:noProof/>
           <w:color w:val="000000" w:themeColor="text1"/>
           <w:sz w:val="36"/>
           <w:szCs w:val="36"/>
@@ -2785,6 +2807,7 @@
       </w:r>
       <w:r>
         <w:rPr>
+          <w:noProof/>
           <w:color w:val="000000" w:themeColor="text1"/>
           <w:sz w:val="36"/>
           <w:szCs w:val="36"/>
@@ -2945,6 +2968,7 @@
       </w:pPr>
       <w:r>
         <w:rPr>
+          <w:noProof/>
           <w:color w:val="000000" w:themeColor="text1"/>
           <w:sz w:val="36"/>
           <w:szCs w:val="36"/>
@@ -2987,6 +3011,7 @@
       </w:r>
       <w:r>
         <w:rPr>
+          <w:noProof/>
           <w:color w:val="000000" w:themeColor="text1"/>
           <w:sz w:val="36"/>
           <w:szCs w:val="36"/>
@@ -3215,6 +3240,7 @@
       </w:pPr>
       <w:r>
         <w:rPr>
+          <w:noProof/>
           <w:color w:val="000000" w:themeColor="text1"/>
           <w:sz w:val="36"/>
           <w:szCs w:val="36"/>
@@ -3257,6 +3283,7 @@
       </w:r>
       <w:r>
         <w:rPr>
+          <w:noProof/>
           <w:color w:val="000000" w:themeColor="text1"/>
           <w:sz w:val="36"/>
           <w:szCs w:val="36"/>
@@ -3424,6 +3451,7 @@
       </w:pPr>
       <w:r>
         <w:rPr>
+          <w:noProof/>
           <w:color w:val="000000" w:themeColor="text1"/>
           <w:sz w:val="36"/>
           <w:szCs w:val="36"/>
@@ -3466,6 +3494,7 @@
       </w:r>
       <w:r>
         <w:rPr>
+          <w:noProof/>
           <w:color w:val="000000" w:themeColor="text1"/>
           <w:sz w:val="36"/>
           <w:szCs w:val="36"/>
@@ -3653,6 +3682,7 @@
       </w:pPr>
       <w:r>
         <w:rPr>
+          <w:noProof/>
           <w:color w:val="000000" w:themeColor="text1"/>
           <w:sz w:val="36"/>
           <w:szCs w:val="36"/>
@@ -3695,6 +3725,7 @@
       </w:r>
       <w:r>
         <w:rPr>
+          <w:noProof/>
           <w:color w:val="000000" w:themeColor="text1"/>
           <w:sz w:val="36"/>
           <w:szCs w:val="36"/>
@@ -3921,6 +3952,7 @@
       </w:pPr>
       <w:r>
         <w:rPr>
+          <w:noProof/>
           <w:color w:val="000000" w:themeColor="text1"/>
           <w:sz w:val="36"/>
           <w:szCs w:val="36"/>
@@ -3963,6 +3995,7 @@
       </w:r>
       <w:r>
         <w:rPr>
+          <w:noProof/>
           <w:color w:val="000000" w:themeColor="text1"/>
           <w:sz w:val="36"/>
           <w:szCs w:val="36"/>
@@ -4154,6 +4187,7 @@
       </w:pPr>
       <w:r>
         <w:rPr>
+          <w:noProof/>
           <w:color w:val="000000" w:themeColor="text1"/>
           <w:sz w:val="36"/>
           <w:szCs w:val="36"/>
@@ -4196,6 +4230,7 @@
       </w:r>
       <w:r>
         <w:rPr>
+          <w:noProof/>
           <w:color w:val="000000" w:themeColor="text1"/>
           <w:sz w:val="36"/>
           <w:szCs w:val="36"/>
@@ -4362,6 +4397,7 @@
       </w:pPr>
       <w:r>
         <w:rPr>
+          <w:noProof/>
           <w:color w:val="000000" w:themeColor="text1"/>
           <w:sz w:val="36"/>
           <w:szCs w:val="36"/>
@@ -4404,6 +4440,7 @@
       </w:r>
       <w:r>
         <w:rPr>
+          <w:noProof/>
           <w:color w:val="000000" w:themeColor="text1"/>
           <w:sz w:val="36"/>
           <w:szCs w:val="36"/>
@@ -4528,6 +4565,7 @@
       </w:pPr>
       <w:r>
         <w:rPr>
+          <w:noProof/>
           <w:color w:val="000000" w:themeColor="text1"/>
           <w:sz w:val="36"/>
           <w:szCs w:val="36"/>
@@ -4570,6 +4608,7 @@
       </w:r>
       <w:r>
         <w:rPr>
+          <w:noProof/>
           <w:color w:val="000000" w:themeColor="text1"/>
           <w:sz w:val="36"/>
           <w:szCs w:val="36"/>
@@ -4736,6 +4775,7 @@
       </w:pPr>
       <w:r>
         <w:rPr>
+          <w:noProof/>
           <w:color w:val="000000" w:themeColor="text1"/>
           <w:sz w:val="36"/>
           <w:szCs w:val="36"/>
@@ -4790,6 +4830,7 @@
       </w:pPr>
       <w:r>
         <w:rPr>
+          <w:noProof/>
           <w:color w:val="000000" w:themeColor="text1"/>
           <w:sz w:val="36"/>
           <w:szCs w:val="36"/>
@@ -4918,6 +4959,7 @@
       </w:pPr>
       <w:r>
         <w:rPr>
+          <w:noProof/>
           <w:color w:val="000000" w:themeColor="text1"/>
           <w:sz w:val="36"/>
           <w:szCs w:val="36"/>
@@ -5092,6 +5134,7 @@
         <w:rPr>
           <w:b/>
           <w:bCs/>
+          <w:noProof/>
           <w:color w:val="000000" w:themeColor="text1"/>
           <w:sz w:val="36"/>
           <w:szCs w:val="36"/>
@@ -5133,8 +5176,929 @@
         </w:drawing>
       </w:r>
     </w:p>
+    <w:p>
+      <w:pPr>
+        <w:tabs>
+          <w:tab w:val="right" w:pos="10466"/>
+        </w:tabs>
+        <w:rPr>
+          <w:color w:val="000000" w:themeColor="text1"/>
+          <w:sz w:val="36"/>
+          <w:szCs w:val="36"/>
+        </w:rPr>
+      </w:pPr>
+      <w:r>
+        <w:rPr>
+          <w:noProof/>
+          <w:color w:val="000000" w:themeColor="text1"/>
+          <w:sz w:val="36"/>
+          <w:szCs w:val="36"/>
+        </w:rPr>
+        <mc:AlternateContent>
+          <mc:Choice Requires="wps">
+            <w:drawing>
+              <wp:anchor distT="0" distB="0" distL="114300" distR="114300" simplePos="0" relativeHeight="251687936" behindDoc="0" locked="0" layoutInCell="1" allowOverlap="1" wp14:anchorId="02224385" wp14:editId="77850813">
+                <wp:simplePos x="0" y="0"/>
+                <wp:positionH relativeFrom="column">
+                  <wp:posOffset>-22860</wp:posOffset>
+                </wp:positionH>
+                <wp:positionV relativeFrom="paragraph">
+                  <wp:posOffset>177165</wp:posOffset>
+                </wp:positionV>
+                <wp:extent cx="6842760" cy="0"/>
+                <wp:effectExtent l="0" t="0" r="0" b="0"/>
+                <wp:wrapNone/>
+                <wp:docPr id="1405280009" name="Straight Connector 15"/>
+                <wp:cNvGraphicFramePr/>
+                <a:graphic xmlns:a="http://schemas.openxmlformats.org/drawingml/2006/main">
+                  <a:graphicData uri="http://schemas.microsoft.com/office/word/2010/wordprocessingShape">
+                    <wps:wsp>
+                      <wps:cNvCnPr/>
+                      <wps:spPr>
+                        <a:xfrm flipV="1">
+                          <a:off x="0" y="0"/>
+                          <a:ext cx="6842760" cy="0"/>
+                        </a:xfrm>
+                        <a:prstGeom prst="line">
+                          <a:avLst/>
+                        </a:prstGeom>
+                      </wps:spPr>
+                      <wps:style>
+                        <a:lnRef idx="1">
+                          <a:schemeClr val="dk1"/>
+                        </a:lnRef>
+                        <a:fillRef idx="0">
+                          <a:schemeClr val="dk1"/>
+                        </a:fillRef>
+                        <a:effectRef idx="0">
+                          <a:schemeClr val="dk1"/>
+                        </a:effectRef>
+                        <a:fontRef idx="minor">
+                          <a:schemeClr val="tx1"/>
+                        </a:fontRef>
+                      </wps:style>
+                      <wps:bodyPr/>
+                    </wps:wsp>
+                  </a:graphicData>
+                </a:graphic>
+                <wp14:sizeRelH relativeFrom="margin">
+                  <wp14:pctWidth>0</wp14:pctWidth>
+                </wp14:sizeRelH>
+                <wp14:sizeRelV relativeFrom="margin">
+                  <wp14:pctHeight>0</wp14:pctHeight>
+                </wp14:sizeRelV>
+              </wp:anchor>
+            </w:drawing>
+          </mc:Choice>
+          <mc:Fallback>
+            <w:pict>
+              <v:line w14:anchorId="37D94547" id="Straight Connector 15" o:spid="_x0000_s1026" style="position:absolute;flip:y;z-index:251687936;visibility:visible;mso-wrap-style:square;mso-width-percent:0;mso-height-percent:0;mso-wrap-distance-left:9pt;mso-wrap-distance-top:0;mso-wrap-distance-right:9pt;mso-wrap-distance-bottom:0;mso-position-horizontal:absolute;mso-position-horizontal-relative:text;mso-position-vertical:absolute;mso-position-vertical-relative:text;mso-width-percent:0;mso-height-percent:0;mso-width-relative:margin;mso-height-relative:margin" from="-1.8pt,13.95pt" to="537pt,13.95pt" o:gfxdata="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" strokecolor="black [3200]" strokeweight=".5pt">
+                <v:stroke joinstyle="miter"/>
+              </v:line>
+            </w:pict>
+          </mc:Fallback>
+        </mc:AlternateContent>
+      </w:r>
+      <w:r>
+        <w:rPr>
+          <w:color w:val="000000" w:themeColor="text1"/>
+          <w:sz w:val="36"/>
+          <w:szCs w:val="36"/>
+        </w:rPr>
+        <w:tab/>
+      </w:r>
+    </w:p>
+    <w:p>
+      <w:pPr>
+        <w:tabs>
+          <w:tab w:val="right" w:pos="10466"/>
+        </w:tabs>
+        <w:rPr>
+          <w:b/>
+          <w:bCs/>
+          <w:color w:val="EE0000"/>
+          <w:sz w:val="36"/>
+          <w:szCs w:val="36"/>
+        </w:rPr>
+      </w:pPr>
+      <w:r>
+        <w:rPr>
+          <w:b/>
+          <w:bCs/>
+          <w:color w:val="EE0000"/>
+          <w:sz w:val="36"/>
+          <w:szCs w:val="36"/>
+          <w:highlight w:val="yellow"/>
+        </w:rPr>
+        <w:t>Creating dimension Tables</w:t>
+      </w:r>
+    </w:p>
+    <w:p>
+      <w:pPr>
+        <w:tabs>
+          <w:tab w:val="right" w:pos="10466"/>
+        </w:tabs>
+        <w:rPr>
+          <w:b/>
+          <w:bCs/>
+          <w:color w:val="0D0D0D" w:themeColor="text1" w:themeTint="F2"/>
+          <w:sz w:val="36"/>
+          <w:szCs w:val="36"/>
+        </w:rPr>
+      </w:pPr>
+      <w:r>
+        <w:rPr>
+          <w:b/>
+          <w:bCs/>
+          <w:color w:val="0D0D0D" w:themeColor="text1" w:themeTint="F2"/>
+          <w:sz w:val="36"/>
+          <w:szCs w:val="36"/>
+        </w:rPr>
+        <w:t>Grades_dimension_table</w:t>
+      </w:r>
+    </w:p>
+    <w:p>
+      <w:pPr>
+        <w:tabs>
+          <w:tab w:val="right" w:pos="10466"/>
+        </w:tabs>
+        <w:rPr>
+          <w:b/>
+          <w:bCs/>
+          <w:color w:val="EE0000"/>
+          <w:sz w:val="36"/>
+          <w:szCs w:val="36"/>
+        </w:rPr>
+      </w:pPr>
+      <w:r>
+        <w:rPr>
+          <w:b/>
+          <w:bCs/>
+          <w:color w:val="EE0000"/>
+          <w:sz w:val="36"/>
+          <w:szCs w:val="36"/>
+        </w:rPr>
+        <w:drawing>
+          <wp:inline distT="0" distB="0" distL="0" distR="0" wp14:anchorId="0CB65D14" wp14:editId="34CBD4F4">
+            <wp:extent cx="6104255" cy="1704975"/>
+            <wp:effectExtent l="0" t="0" r="0" b="9525"/>
+            <wp:docPr id="1907147634" name="Picture 1"/>
+            <wp:cNvGraphicFramePr>
+              <a:graphicFrameLocks xmlns:a="http://schemas.openxmlformats.org/drawingml/2006/main" noChangeAspect="1"/>
+            </wp:cNvGraphicFramePr>
+            <a:graphic xmlns:a="http://schemas.openxmlformats.org/drawingml/2006/main">
+              <a:graphicData uri="http://schemas.openxmlformats.org/drawingml/2006/picture">
+                <pic:pic xmlns:pic="http://schemas.openxmlformats.org/drawingml/2006/picture">
+                  <pic:nvPicPr>
+                    <pic:cNvPr id="1907147634" name=""/>
+                    <pic:cNvPicPr/>
+                  </pic:nvPicPr>
+                  <pic:blipFill>
+                    <a:blip r:embed="rId57"/>
+                    <a:stretch>
+                      <a:fillRect/>
+                    </a:stretch>
+                  </pic:blipFill>
+                  <pic:spPr>
+                    <a:xfrm>
+                      <a:off x="0" y="0"/>
+                      <a:ext cx="6140949" cy="1715224"/>
+                    </a:xfrm>
+                    <a:prstGeom prst="rect">
+                      <a:avLst/>
+                    </a:prstGeom>
+                  </pic:spPr>
+                </pic:pic>
+              </a:graphicData>
+            </a:graphic>
+          </wp:inline>
+        </w:drawing>
+      </w:r>
+    </w:p>
+    <w:p>
+      <w:pPr>
+        <w:tabs>
+          <w:tab w:val="right" w:pos="10466"/>
+        </w:tabs>
+        <w:rPr>
+          <w:b/>
+          <w:bCs/>
+          <w:color w:val="000000" w:themeColor="text1"/>
+          <w:sz w:val="36"/>
+          <w:szCs w:val="36"/>
+        </w:rPr>
+      </w:pPr>
+      <w:r>
+        <w:rPr>
+          <w:b/>
+          <w:bCs/>
+          <w:color w:val="000000" w:themeColor="text1"/>
+          <w:sz w:val="36"/>
+          <w:szCs w:val="36"/>
+        </w:rPr>
+        <w:drawing>
+          <wp:inline distT="0" distB="0" distL="0" distR="0" wp14:anchorId="010508ED" wp14:editId="7163A96C">
+            <wp:extent cx="6038850" cy="501650"/>
+            <wp:effectExtent l="0" t="0" r="0" b="0"/>
+            <wp:docPr id="1831712484" name="Picture 1"/>
+            <wp:cNvGraphicFramePr>
+              <a:graphicFrameLocks xmlns:a="http://schemas.openxmlformats.org/drawingml/2006/main" noChangeAspect="1"/>
+            </wp:cNvGraphicFramePr>
+            <a:graphic xmlns:a="http://schemas.openxmlformats.org/drawingml/2006/main">
+              <a:graphicData uri="http://schemas.openxmlformats.org/drawingml/2006/picture">
+                <pic:pic xmlns:pic="http://schemas.openxmlformats.org/drawingml/2006/picture">
+                  <pic:nvPicPr>
+                    <pic:cNvPr id="1831712484" name=""/>
+                    <pic:cNvPicPr/>
+                  </pic:nvPicPr>
+                  <pic:blipFill>
+                    <a:blip r:embed="rId58"/>
+                    <a:stretch>
+                      <a:fillRect/>
+                    </a:stretch>
+                  </pic:blipFill>
+                  <pic:spPr>
+                    <a:xfrm>
+                      <a:off x="0" y="0"/>
+                      <a:ext cx="6364213" cy="528678"/>
+                    </a:xfrm>
+                    <a:prstGeom prst="rect">
+                      <a:avLst/>
+                    </a:prstGeom>
+                  </pic:spPr>
+                </pic:pic>
+              </a:graphicData>
+            </a:graphic>
+          </wp:inline>
+        </w:drawing>
+      </w:r>
+    </w:p>
+    <w:p>
+      <w:pPr>
+        <w:tabs>
+          <w:tab w:val="right" w:pos="10466"/>
+        </w:tabs>
+        <w:rPr>
+          <w:b/>
+          <w:bCs/>
+          <w:color w:val="000000" w:themeColor="text1"/>
+          <w:sz w:val="36"/>
+          <w:szCs w:val="36"/>
+        </w:rPr>
+      </w:pPr>
+      <w:r>
+        <w:rPr>
+          <w:b/>
+          <w:bCs/>
+          <w:color w:val="000000" w:themeColor="text1"/>
+          <w:sz w:val="36"/>
+          <w:szCs w:val="36"/>
+        </w:rPr>
+        <w:lastRenderedPageBreak/>
+        <w:t>Purpose_dimension_table</w:t>
+      </w:r>
+    </w:p>
+    <w:p>
+      <w:pPr>
+        <w:tabs>
+          <w:tab w:val="right" w:pos="10466"/>
+        </w:tabs>
+        <w:rPr>
+          <w:b/>
+          <w:bCs/>
+          <w:color w:val="000000" w:themeColor="text1"/>
+          <w:sz w:val="36"/>
+          <w:szCs w:val="36"/>
+        </w:rPr>
+      </w:pPr>
+      <w:r>
+        <w:rPr>
+          <w:b/>
+          <w:bCs/>
+          <w:color w:val="000000" w:themeColor="text1"/>
+          <w:sz w:val="36"/>
+          <w:szCs w:val="36"/>
+        </w:rPr>
+        <w:drawing>
+          <wp:inline distT="0" distB="0" distL="0" distR="0" wp14:anchorId="754E1571" wp14:editId="75FE8AFE">
+            <wp:extent cx="5362575" cy="1637665"/>
+            <wp:effectExtent l="0" t="0" r="9525" b="635"/>
+            <wp:docPr id="1030064938" name="Picture 1"/>
+            <wp:cNvGraphicFramePr>
+              <a:graphicFrameLocks xmlns:a="http://schemas.openxmlformats.org/drawingml/2006/main" noChangeAspect="1"/>
+            </wp:cNvGraphicFramePr>
+            <a:graphic xmlns:a="http://schemas.openxmlformats.org/drawingml/2006/main">
+              <a:graphicData uri="http://schemas.openxmlformats.org/drawingml/2006/picture">
+                <pic:pic xmlns:pic="http://schemas.openxmlformats.org/drawingml/2006/picture">
+                  <pic:nvPicPr>
+                    <pic:cNvPr id="1030064938" name=""/>
+                    <pic:cNvPicPr/>
+                  </pic:nvPicPr>
+                  <pic:blipFill>
+                    <a:blip r:embed="rId59"/>
+                    <a:stretch>
+                      <a:fillRect/>
+                    </a:stretch>
+                  </pic:blipFill>
+                  <pic:spPr>
+                    <a:xfrm>
+                      <a:off x="0" y="0"/>
+                      <a:ext cx="5373800" cy="1641093"/>
+                    </a:xfrm>
+                    <a:prstGeom prst="rect">
+                      <a:avLst/>
+                    </a:prstGeom>
+                  </pic:spPr>
+                </pic:pic>
+              </a:graphicData>
+            </a:graphic>
+          </wp:inline>
+        </w:drawing>
+      </w:r>
+    </w:p>
+    <w:p>
+      <w:pPr>
+        <w:tabs>
+          <w:tab w:val="right" w:pos="10466"/>
+        </w:tabs>
+        <w:rPr>
+          <w:b/>
+          <w:bCs/>
+          <w:color w:val="000000" w:themeColor="text1"/>
+          <w:sz w:val="36"/>
+          <w:szCs w:val="36"/>
+        </w:rPr>
+      </w:pPr>
+      <w:r>
+        <w:rPr>
+          <w:b/>
+          <w:bCs/>
+          <w:color w:val="000000" w:themeColor="text1"/>
+          <w:sz w:val="36"/>
+          <w:szCs w:val="36"/>
+        </w:rPr>
+        <w:drawing>
+          <wp:inline distT="0" distB="0" distL="0" distR="0" wp14:anchorId="234600D0" wp14:editId="645B27E2">
+            <wp:extent cx="6115050" cy="662939"/>
+            <wp:effectExtent l="0" t="0" r="0" b="4445"/>
+            <wp:docPr id="39914514" name="Picture 1"/>
+            <wp:cNvGraphicFramePr>
+              <a:graphicFrameLocks xmlns:a="http://schemas.openxmlformats.org/drawingml/2006/main" noChangeAspect="1"/>
+            </wp:cNvGraphicFramePr>
+            <a:graphic xmlns:a="http://schemas.openxmlformats.org/drawingml/2006/main">
+              <a:graphicData uri="http://schemas.openxmlformats.org/drawingml/2006/picture">
+                <pic:pic xmlns:pic="http://schemas.openxmlformats.org/drawingml/2006/picture">
+                  <pic:nvPicPr>
+                    <pic:cNvPr id="39914514" name=""/>
+                    <pic:cNvPicPr/>
+                  </pic:nvPicPr>
+                  <pic:blipFill>
+                    <a:blip r:embed="rId60"/>
+                    <a:stretch>
+                      <a:fillRect/>
+                    </a:stretch>
+                  </pic:blipFill>
+                  <pic:spPr>
+                    <a:xfrm>
+                      <a:off x="0" y="0"/>
+                      <a:ext cx="6186209" cy="670653"/>
+                    </a:xfrm>
+                    <a:prstGeom prst="rect">
+                      <a:avLst/>
+                    </a:prstGeom>
+                  </pic:spPr>
+                </pic:pic>
+              </a:graphicData>
+            </a:graphic>
+          </wp:inline>
+        </w:drawing>
+      </w:r>
+    </w:p>
+    <w:p>
+      <w:pPr>
+        <w:tabs>
+          <w:tab w:val="right" w:pos="10466"/>
+        </w:tabs>
+        <w:rPr>
+          <w:color w:val="000000" w:themeColor="text1"/>
+          <w:sz w:val="36"/>
+          <w:szCs w:val="36"/>
+        </w:rPr>
+      </w:pPr>
+      <w:r>
+        <w:rPr>
+          <w:noProof/>
+          <w:color w:val="000000" w:themeColor="text1"/>
+          <w:sz w:val="36"/>
+          <w:szCs w:val="36"/>
+        </w:rPr>
+        <mc:AlternateContent>
+          <mc:Choice Requires="wps">
+            <w:drawing>
+              <wp:anchor distT="0" distB="0" distL="114300" distR="114300" simplePos="0" relativeHeight="251689984" behindDoc="0" locked="0" layoutInCell="1" allowOverlap="1" wp14:anchorId="7D2FE29D" wp14:editId="31158D4F">
+                <wp:simplePos x="0" y="0"/>
+                <wp:positionH relativeFrom="column">
+                  <wp:posOffset>-22860</wp:posOffset>
+                </wp:positionH>
+                <wp:positionV relativeFrom="paragraph">
+                  <wp:posOffset>177165</wp:posOffset>
+                </wp:positionV>
+                <wp:extent cx="6842760" cy="0"/>
+                <wp:effectExtent l="0" t="0" r="0" b="0"/>
+                <wp:wrapNone/>
+                <wp:docPr id="673932651" name="Straight Connector 15"/>
+                <wp:cNvGraphicFramePr/>
+                <a:graphic xmlns:a="http://schemas.openxmlformats.org/drawingml/2006/main">
+                  <a:graphicData uri="http://schemas.microsoft.com/office/word/2010/wordprocessingShape">
+                    <wps:wsp>
+                      <wps:cNvCnPr/>
+                      <wps:spPr>
+                        <a:xfrm flipV="1">
+                          <a:off x="0" y="0"/>
+                          <a:ext cx="6842760" cy="0"/>
+                        </a:xfrm>
+                        <a:prstGeom prst="line">
+                          <a:avLst/>
+                        </a:prstGeom>
+                      </wps:spPr>
+                      <wps:style>
+                        <a:lnRef idx="1">
+                          <a:schemeClr val="dk1"/>
+                        </a:lnRef>
+                        <a:fillRef idx="0">
+                          <a:schemeClr val="dk1"/>
+                        </a:fillRef>
+                        <a:effectRef idx="0">
+                          <a:schemeClr val="dk1"/>
+                        </a:effectRef>
+                        <a:fontRef idx="minor">
+                          <a:schemeClr val="tx1"/>
+                        </a:fontRef>
+                      </wps:style>
+                      <wps:bodyPr/>
+                    </wps:wsp>
+                  </a:graphicData>
+                </a:graphic>
+                <wp14:sizeRelH relativeFrom="margin">
+                  <wp14:pctWidth>0</wp14:pctWidth>
+                </wp14:sizeRelH>
+                <wp14:sizeRelV relativeFrom="margin">
+                  <wp14:pctHeight>0</wp14:pctHeight>
+                </wp14:sizeRelV>
+              </wp:anchor>
+            </w:drawing>
+          </mc:Choice>
+          <mc:Fallback>
+            <w:pict>
+              <v:line w14:anchorId="7F763AE5" id="Straight Connector 15" o:spid="_x0000_s1026" style="position:absolute;flip:y;z-index:251689984;visibility:visible;mso-wrap-style:square;mso-width-percent:0;mso-height-percent:0;mso-wrap-distance-left:9pt;mso-wrap-distance-top:0;mso-wrap-distance-right:9pt;mso-wrap-distance-bottom:0;mso-position-horizontal:absolute;mso-position-horizontal-relative:text;mso-position-vertical:absolute;mso-position-vertical-relative:text;mso-width-percent:0;mso-height-percent:0;mso-width-relative:margin;mso-height-relative:margin" from="-1.8pt,13.95pt" to="537pt,13.95pt" o:gfxdata="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" strokecolor="black [3200]" strokeweight=".5pt">
+                <v:stroke joinstyle="miter"/>
+              </v:line>
+            </w:pict>
+          </mc:Fallback>
+        </mc:AlternateContent>
+      </w:r>
+      <w:r>
+        <w:rPr>
+          <w:color w:val="000000" w:themeColor="text1"/>
+          <w:sz w:val="36"/>
+          <w:szCs w:val="36"/>
+        </w:rPr>
+        <w:tab/>
+      </w:r>
+    </w:p>
+    <w:p>
+      <w:pPr>
+        <w:tabs>
+          <w:tab w:val="right" w:pos="10466"/>
+        </w:tabs>
+        <w:rPr>
+          <w:b/>
+          <w:bCs/>
+          <w:color w:val="000000" w:themeColor="text1"/>
+          <w:sz w:val="36"/>
+          <w:szCs w:val="36"/>
+        </w:rPr>
+      </w:pPr>
+      <w:r>
+        <w:rPr>
+          <w:b/>
+          <w:bCs/>
+          <w:color w:val="000000" w:themeColor="text1"/>
+          <w:sz w:val="36"/>
+          <w:szCs w:val="36"/>
+        </w:rPr>
+        <w:t>Geography_dimension_table</w:t>
+      </w:r>
+    </w:p>
+    <w:p>
+      <w:pPr>
+        <w:tabs>
+          <w:tab w:val="right" w:pos="10466"/>
+        </w:tabs>
+        <w:rPr>
+          <w:b/>
+          <w:bCs/>
+          <w:color w:val="000000" w:themeColor="text1"/>
+          <w:sz w:val="36"/>
+          <w:szCs w:val="36"/>
+        </w:rPr>
+      </w:pPr>
+      <w:r>
+        <w:rPr>
+          <w:b/>
+          <w:bCs/>
+          <w:color w:val="000000" w:themeColor="text1"/>
+          <w:sz w:val="36"/>
+          <w:szCs w:val="36"/>
+        </w:rPr>
+        <w:drawing>
+          <wp:inline distT="0" distB="0" distL="0" distR="0" wp14:anchorId="20FCCAE9" wp14:editId="1D00FF99">
+            <wp:extent cx="5349704" cy="2072820"/>
+            <wp:effectExtent l="0" t="0" r="3810" b="3810"/>
+            <wp:docPr id="2030442066" name="Picture 1"/>
+            <wp:cNvGraphicFramePr>
+              <a:graphicFrameLocks xmlns:a="http://schemas.openxmlformats.org/drawingml/2006/main" noChangeAspect="1"/>
+            </wp:cNvGraphicFramePr>
+            <a:graphic xmlns:a="http://schemas.openxmlformats.org/drawingml/2006/main">
+              <a:graphicData uri="http://schemas.openxmlformats.org/drawingml/2006/picture">
+                <pic:pic xmlns:pic="http://schemas.openxmlformats.org/drawingml/2006/picture">
+                  <pic:nvPicPr>
+                    <pic:cNvPr id="2030442066" name=""/>
+                    <pic:cNvPicPr/>
+                  </pic:nvPicPr>
+                  <pic:blipFill>
+                    <a:blip r:embed="rId61"/>
+                    <a:stretch>
+                      <a:fillRect/>
+                    </a:stretch>
+                  </pic:blipFill>
+                  <pic:spPr>
+                    <a:xfrm>
+                      <a:off x="0" y="0"/>
+                      <a:ext cx="5349704" cy="2072820"/>
+                    </a:xfrm>
+                    <a:prstGeom prst="rect">
+                      <a:avLst/>
+                    </a:prstGeom>
+                  </pic:spPr>
+                </pic:pic>
+              </a:graphicData>
+            </a:graphic>
+          </wp:inline>
+        </w:drawing>
+      </w:r>
+    </w:p>
+    <w:p>
+      <w:pPr>
+        <w:tabs>
+          <w:tab w:val="right" w:pos="10466"/>
+        </w:tabs>
+        <w:rPr>
+          <w:b/>
+          <w:bCs/>
+          <w:color w:val="000000" w:themeColor="text1"/>
+          <w:sz w:val="36"/>
+          <w:szCs w:val="36"/>
+        </w:rPr>
+      </w:pPr>
+      <w:r>
+        <w:rPr>
+          <w:b/>
+          <w:bCs/>
+          <w:color w:val="000000" w:themeColor="text1"/>
+          <w:sz w:val="36"/>
+          <w:szCs w:val="36"/>
+        </w:rPr>
+        <w:drawing>
+          <wp:inline distT="0" distB="0" distL="0" distR="0" wp14:anchorId="097AF1FE" wp14:editId="295D8D5E">
+            <wp:extent cx="6391275" cy="807720"/>
+            <wp:effectExtent l="0" t="0" r="9525" b="0"/>
+            <wp:docPr id="864360523" name="Picture 1"/>
+            <wp:cNvGraphicFramePr>
+              <a:graphicFrameLocks xmlns:a="http://schemas.openxmlformats.org/drawingml/2006/main" noChangeAspect="1"/>
+            </wp:cNvGraphicFramePr>
+            <a:graphic xmlns:a="http://schemas.openxmlformats.org/drawingml/2006/main">
+              <a:graphicData uri="http://schemas.openxmlformats.org/drawingml/2006/picture">
+                <pic:pic xmlns:pic="http://schemas.openxmlformats.org/drawingml/2006/picture">
+                  <pic:nvPicPr>
+                    <pic:cNvPr id="864360523" name=""/>
+                    <pic:cNvPicPr/>
+                  </pic:nvPicPr>
+                  <pic:blipFill>
+                    <a:blip r:embed="rId62"/>
+                    <a:stretch>
+                      <a:fillRect/>
+                    </a:stretch>
+                  </pic:blipFill>
+                  <pic:spPr>
+                    <a:xfrm>
+                      <a:off x="0" y="0"/>
+                      <a:ext cx="6391829" cy="807790"/>
+                    </a:xfrm>
+                    <a:prstGeom prst="rect">
+                      <a:avLst/>
+                    </a:prstGeom>
+                  </pic:spPr>
+                </pic:pic>
+              </a:graphicData>
+            </a:graphic>
+          </wp:inline>
+        </w:drawing>
+      </w:r>
+    </w:p>
+    <w:p>
+      <w:pPr>
+        <w:tabs>
+          <w:tab w:val="right" w:pos="10466"/>
+        </w:tabs>
+        <w:rPr>
+          <w:color w:val="000000" w:themeColor="text1"/>
+          <w:sz w:val="36"/>
+          <w:szCs w:val="36"/>
+        </w:rPr>
+      </w:pPr>
+      <w:r>
+        <w:rPr>
+          <w:noProof/>
+          <w:color w:val="000000" w:themeColor="text1"/>
+          <w:sz w:val="36"/>
+          <w:szCs w:val="36"/>
+        </w:rPr>
+        <mc:AlternateContent>
+          <mc:Choice Requires="wps">
+            <w:drawing>
+              <wp:anchor distT="0" distB="0" distL="114300" distR="114300" simplePos="0" relativeHeight="251692032" behindDoc="0" locked="0" layoutInCell="1" allowOverlap="1" wp14:anchorId="356E7DBC" wp14:editId="6ADA597B">
+                <wp:simplePos x="0" y="0"/>
+                <wp:positionH relativeFrom="column">
+                  <wp:posOffset>-22860</wp:posOffset>
+                </wp:positionH>
+                <wp:positionV relativeFrom="paragraph">
+                  <wp:posOffset>177165</wp:posOffset>
+                </wp:positionV>
+                <wp:extent cx="6842760" cy="0"/>
+                <wp:effectExtent l="0" t="0" r="0" b="0"/>
+                <wp:wrapNone/>
+                <wp:docPr id="1135225515" name="Straight Connector 15"/>
+                <wp:cNvGraphicFramePr/>
+                <a:graphic xmlns:a="http://schemas.openxmlformats.org/drawingml/2006/main">
+                  <a:graphicData uri="http://schemas.microsoft.com/office/word/2010/wordprocessingShape">
+                    <wps:wsp>
+                      <wps:cNvCnPr/>
+                      <wps:spPr>
+                        <a:xfrm flipV="1">
+                          <a:off x="0" y="0"/>
+                          <a:ext cx="6842760" cy="0"/>
+                        </a:xfrm>
+                        <a:prstGeom prst="line">
+                          <a:avLst/>
+                        </a:prstGeom>
+                      </wps:spPr>
+                      <wps:style>
+                        <a:lnRef idx="1">
+                          <a:schemeClr val="dk1"/>
+                        </a:lnRef>
+                        <a:fillRef idx="0">
+                          <a:schemeClr val="dk1"/>
+                        </a:fillRef>
+                        <a:effectRef idx="0">
+                          <a:schemeClr val="dk1"/>
+                        </a:effectRef>
+                        <a:fontRef idx="minor">
+                          <a:schemeClr val="tx1"/>
+                        </a:fontRef>
+                      </wps:style>
+                      <wps:bodyPr/>
+                    </wps:wsp>
+                  </a:graphicData>
+                </a:graphic>
+                <wp14:sizeRelH relativeFrom="margin">
+                  <wp14:pctWidth>0</wp14:pctWidth>
+                </wp14:sizeRelH>
+                <wp14:sizeRelV relativeFrom="margin">
+                  <wp14:pctHeight>0</wp14:pctHeight>
+                </wp14:sizeRelV>
+              </wp:anchor>
+            </w:drawing>
+          </mc:Choice>
+          <mc:Fallback>
+            <w:pict>
+              <v:line w14:anchorId="30ADC7A3" id="Straight Connector 15" o:spid="_x0000_s1026" style="position:absolute;flip:y;z-index:251692032;visibility:visible;mso-wrap-style:square;mso-width-percent:0;mso-height-percent:0;mso-wrap-distance-left:9pt;mso-wrap-distance-top:0;mso-wrap-distance-right:9pt;mso-wrap-distance-bottom:0;mso-position-horizontal:absolute;mso-position-horizontal-relative:text;mso-position-vertical:absolute;mso-position-vertical-relative:text;mso-width-percent:0;mso-height-percent:0;mso-width-relative:margin;mso-height-relative:margin" from="-1.8pt,13.95pt" to="537pt,13.95pt" o:gfxdata="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" strokecolor="black [3200]" strokeweight=".5pt">
+                <v:stroke joinstyle="miter"/>
+              </v:line>
+            </w:pict>
+          </mc:Fallback>
+        </mc:AlternateContent>
+      </w:r>
+      <w:r>
+        <w:rPr>
+          <w:color w:val="000000" w:themeColor="text1"/>
+          <w:sz w:val="36"/>
+          <w:szCs w:val="36"/>
+        </w:rPr>
+        <w:tab/>
+      </w:r>
+    </w:p>
+    <w:p>
+      <w:pPr>
+        <w:tabs>
+          <w:tab w:val="right" w:pos="10466"/>
+        </w:tabs>
+        <w:rPr>
+          <w:b/>
+          <w:bCs/>
+          <w:color w:val="000000" w:themeColor="text1"/>
+          <w:sz w:val="36"/>
+          <w:szCs w:val="36"/>
+        </w:rPr>
+      </w:pPr>
+      <w:r>
+        <w:rPr>
+          <w:b/>
+          <w:bCs/>
+          <w:color w:val="000000" w:themeColor="text1"/>
+          <w:sz w:val="36"/>
+          <w:szCs w:val="36"/>
+        </w:rPr>
+        <w:t>Date_bimension_table</w:t>
+      </w:r>
+    </w:p>
+    <w:p>
+      <w:pPr>
+        <w:tabs>
+          <w:tab w:val="right" w:pos="10466"/>
+        </w:tabs>
+        <w:rPr>
+          <w:b/>
+          <w:bCs/>
+          <w:color w:val="000000" w:themeColor="text1"/>
+          <w:sz w:val="36"/>
+          <w:szCs w:val="36"/>
+        </w:rPr>
+      </w:pPr>
+      <w:r>
+        <w:rPr>
+          <w:b/>
+          <w:bCs/>
+          <w:color w:val="000000" w:themeColor="text1"/>
+          <w:sz w:val="36"/>
+          <w:szCs w:val="36"/>
+        </w:rPr>
+        <w:drawing>
+          <wp:inline distT="0" distB="0" distL="0" distR="0" wp14:anchorId="5B0CFFED" wp14:editId="19C5FC66">
+            <wp:extent cx="5724525" cy="1854835"/>
+            <wp:effectExtent l="0" t="0" r="9525" b="0"/>
+            <wp:docPr id="1354805034" name="Picture 1"/>
+            <wp:cNvGraphicFramePr>
+              <a:graphicFrameLocks xmlns:a="http://schemas.openxmlformats.org/drawingml/2006/main" noChangeAspect="1"/>
+            </wp:cNvGraphicFramePr>
+            <a:graphic xmlns:a="http://schemas.openxmlformats.org/drawingml/2006/main">
+              <a:graphicData uri="http://schemas.openxmlformats.org/drawingml/2006/picture">
+                <pic:pic xmlns:pic="http://schemas.openxmlformats.org/drawingml/2006/picture">
+                  <pic:nvPicPr>
+                    <pic:cNvPr id="1354805034" name=""/>
+                    <pic:cNvPicPr/>
+                  </pic:nvPicPr>
+                  <pic:blipFill>
+                    <a:blip r:embed="rId63"/>
+                    <a:stretch>
+                      <a:fillRect/>
+                    </a:stretch>
+                  </pic:blipFill>
+                  <pic:spPr>
+                    <a:xfrm>
+                      <a:off x="0" y="0"/>
+                      <a:ext cx="5751431" cy="1863553"/>
+                    </a:xfrm>
+                    <a:prstGeom prst="rect">
+                      <a:avLst/>
+                    </a:prstGeom>
+                  </pic:spPr>
+                </pic:pic>
+              </a:graphicData>
+            </a:graphic>
+          </wp:inline>
+        </w:drawing>
+      </w:r>
+    </w:p>
+    <w:p>
+      <w:pPr>
+        <w:tabs>
+          <w:tab w:val="right" w:pos="10466"/>
+        </w:tabs>
+        <w:rPr>
+          <w:b/>
+          <w:bCs/>
+          <w:color w:val="000000" w:themeColor="text1"/>
+          <w:sz w:val="36"/>
+          <w:szCs w:val="36"/>
+        </w:rPr>
+      </w:pPr>
+      <w:r>
+        <w:rPr>
+          <w:b/>
+          <w:bCs/>
+          <w:color w:val="000000" w:themeColor="text1"/>
+          <w:sz w:val="36"/>
+          <w:szCs w:val="36"/>
+        </w:rPr>
+        <w:lastRenderedPageBreak/>
+        <w:drawing>
+          <wp:inline distT="0" distB="0" distL="0" distR="0" wp14:anchorId="5E71DA7E" wp14:editId="4EFAD9D4">
+            <wp:extent cx="5943600" cy="2630805"/>
+            <wp:effectExtent l="0" t="0" r="0" b="0"/>
+            <wp:docPr id="1977889163" name="Picture 1"/>
+            <wp:cNvGraphicFramePr>
+              <a:graphicFrameLocks xmlns:a="http://schemas.openxmlformats.org/drawingml/2006/main" noChangeAspect="1"/>
+            </wp:cNvGraphicFramePr>
+            <a:graphic xmlns:a="http://schemas.openxmlformats.org/drawingml/2006/main">
+              <a:graphicData uri="http://schemas.openxmlformats.org/drawingml/2006/picture">
+                <pic:pic xmlns:pic="http://schemas.openxmlformats.org/drawingml/2006/picture">
+                  <pic:nvPicPr>
+                    <pic:cNvPr id="1977889163" name=""/>
+                    <pic:cNvPicPr/>
+                  </pic:nvPicPr>
+                  <pic:blipFill>
+                    <a:blip r:embed="rId64"/>
+                    <a:stretch>
+                      <a:fillRect/>
+                    </a:stretch>
+                  </pic:blipFill>
+                  <pic:spPr>
+                    <a:xfrm>
+                      <a:off x="0" y="0"/>
+                      <a:ext cx="5955531" cy="2636086"/>
+                    </a:xfrm>
+                    <a:prstGeom prst="rect">
+                      <a:avLst/>
+                    </a:prstGeom>
+                  </pic:spPr>
+                </pic:pic>
+              </a:graphicData>
+            </a:graphic>
+          </wp:inline>
+        </w:drawing>
+      </w:r>
+    </w:p>
+    <w:p>
+      <w:pPr>
+        <w:tabs>
+          <w:tab w:val="right" w:pos="10466"/>
+        </w:tabs>
+        <w:rPr>
+          <w:b/>
+          <w:bCs/>
+          <w:color w:val="000000" w:themeColor="text1"/>
+          <w:sz w:val="36"/>
+          <w:szCs w:val="36"/>
+        </w:rPr>
+      </w:pPr>
+      <w:r>
+        <w:rPr>
+          <w:b/>
+          <w:bCs/>
+          <w:color w:val="000000" w:themeColor="text1"/>
+          <w:sz w:val="36"/>
+          <w:szCs w:val="36"/>
+        </w:rPr>
+        <w:drawing>
+          <wp:inline distT="0" distB="0" distL="0" distR="0" wp14:anchorId="7FEB7A63" wp14:editId="0398D91E">
+            <wp:extent cx="5695950" cy="762000"/>
+            <wp:effectExtent l="0" t="0" r="0" b="0"/>
+            <wp:docPr id="1541725568" name="Picture 1"/>
+            <wp:cNvGraphicFramePr>
+              <a:graphicFrameLocks xmlns:a="http://schemas.openxmlformats.org/drawingml/2006/main" noChangeAspect="1"/>
+            </wp:cNvGraphicFramePr>
+            <a:graphic xmlns:a="http://schemas.openxmlformats.org/drawingml/2006/main">
+              <a:graphicData uri="http://schemas.openxmlformats.org/drawingml/2006/picture">
+                <pic:pic xmlns:pic="http://schemas.openxmlformats.org/drawingml/2006/picture">
+                  <pic:nvPicPr>
+                    <pic:cNvPr id="1541725568" name=""/>
+                    <pic:cNvPicPr/>
+                  </pic:nvPicPr>
+                  <pic:blipFill>
+                    <a:blip r:embed="rId65"/>
+                    <a:stretch>
+                      <a:fillRect/>
+                    </a:stretch>
+                  </pic:blipFill>
+                  <pic:spPr>
+                    <a:xfrm>
+                      <a:off x="0" y="0"/>
+                      <a:ext cx="5696444" cy="762066"/>
+                    </a:xfrm>
+                    <a:prstGeom prst="rect">
+                      <a:avLst/>
+                    </a:prstGeom>
+                  </pic:spPr>
+                </pic:pic>
+              </a:graphicData>
+            </a:graphic>
+          </wp:inline>
+        </w:drawing>
+      </w:r>
+    </w:p>
     <w:sectPr>
-      <w:headerReference w:type="default" r:id="rId57"/>
+      <w:headerReference w:type="default" r:id="rId66"/>
       <w:pgSz w:w="11906" w:h="16838"/>
       <w:pgMar w:top="567" w:right="720" w:bottom="567" w:left="720" w:header="709" w:footer="709" w:gutter="0"/>
       <w:cols w:space="708"/>
@@ -5238,7 +6202,7 @@
               </v:handles>
               <o:lock v:ext="edit" text="t" shapetype="t"/>
             </v:shapetype>
-            <v:shape id="PowerPlusWaterMarkObject92425783" o:spid="_x0000_s1025" type="#_x0000_t136" style="position:absolute;margin-left:0;margin-top:0;width:461.1pt;height:276.65pt;rotation:315;z-index:-251657216;mso-position-horizontal:center;mso-position-horizontal-relative:margin;mso-position-vertical:center;mso-position-vertical-relative:margin" o:allowincell="f" fillcolor="silver" stroked="f">
+            <v:shape id="PowerPlusWaterMarkObject92425783" o:spid="_x0000_s1025" type="#_x0000_t136" style="position:absolute;margin-left:0;margin-top:0;width:461.1pt;height:276.65pt;rotation:315;z-index:-251658752;mso-position-horizontal:center;mso-position-horizontal-relative:margin;mso-position-vertical:center;mso-position-vertical-relative:margin" o:allowincell="f" fillcolor="silver" stroked="f">
               <v:fill opacity=".5"/>
               <v:textpath style="font-family:&quot;Calibri&quot;;font-size:1pt" string="SURYA"/>
               <w10:wrap anchorx="margin" anchory="margin"/>
@@ -5651,7 +6615,7 @@
   <w:style w:type="paragraph" w:default="1" w:styleId="Normal">
     <w:name w:val="Normal"/>
     <w:qFormat/>
-    <w:rsid w:val="009B4EB2"/>
+    <w:rsid w:val="00C93253"/>
   </w:style>
   <w:style w:type="paragraph" w:styleId="Heading1">
     <w:name w:val="heading 1"/>
@@ -5854,6 +6818,7 @@
   <w:style w:type="character" w:default="1" w:styleId="DefaultParagraphFont">
     <w:name w:val="Default Paragraph Font"/>
     <w:uiPriority w:val="1"/>
+    <w:semiHidden/>
     <w:unhideWhenUsed/>
   </w:style>
   <w:style w:type="table" w:default="1" w:styleId="TableNormal">

</xml_diff>